<commit_message>
Client page restructure, Sprint 36 (Reviews Phase A), and polish round
</commit_message>
<xml_diff>
--- a/src/templates/prepped/lien-waiver-conditional.docx
+++ b/src/templates/prepped/lien-waiver-conditional.docx
@@ -487,10 +487,10 @@
       </w:pPr>
       <w:r>
         <w:rPr>
-          <w:sz w:val="40"/>
-          <w:szCs w:val="40"/>
-        </w:rPr>
-        <w:t xml:space="preserve"/>
+          <w:sz w:val="28"/>
+          <w:szCs w:val="28"/>
+        </w:rPr>
+        <w:t xml:space="preserve">{{contractor_signature}}</w:t>
       </w:r>
     </w:p>
     <w:p>
@@ -530,7 +530,7 @@
           <w:sz w:val="28"/>
           <w:szCs w:val="28"/>
         </w:rPr>
-        <w:t xml:space="preserve"/>
+        <w:t xml:space="preserve">Tony Columbus</w:t>
       </w:r>
     </w:p>
     <w:p>
@@ -570,7 +570,7 @@
           <w:sz w:val="28"/>
           <w:szCs w:val="28"/>
         </w:rPr>
-        <w:t xml:space="preserve"/>
+        <w:t xml:space="preserve">{{contractor_date}}</w:t>
       </w:r>
     </w:p>
     <w:p>

</xml_diff>